<commit_message>
Se agregó documentación para proyectos de microservicios
</commit_message>
<xml_diff>
--- a/Arquitectura_de_Microservicios.docx
+++ b/Arquitectura_de_Microservicios.docx
@@ -696,6 +696,9 @@
     </w:p>
     <w:p>
       <w:r>
+        <w:rPr>
+          <w:noProof/>
+        </w:rPr>
         <w:drawing>
           <wp:inline distT="0" distB="0" distL="0" distR="0" wp14:anchorId="51A0A381" wp14:editId="51FD3D84">
             <wp:extent cx="4327953" cy="3104311"/>
@@ -759,6 +762,9 @@
     </w:p>
     <w:p>
       <w:r>
+        <w:rPr>
+          <w:noProof/>
+        </w:rPr>
         <w:drawing>
           <wp:inline distT="0" distB="0" distL="0" distR="0" wp14:anchorId="508F2750" wp14:editId="601C064A">
             <wp:extent cx="6337728" cy="2565817"/>
@@ -813,6 +819,9 @@
     </w:p>
     <w:p>
       <w:r>
+        <w:rPr>
+          <w:noProof/>
+        </w:rPr>
         <w:drawing>
           <wp:inline distT="0" distB="0" distL="0" distR="0" wp14:anchorId="50454FBD" wp14:editId="7546E760">
             <wp:extent cx="6353397" cy="2535382"/>
@@ -865,6 +874,9 @@
     </w:p>
     <w:p>
       <w:r>
+        <w:rPr>
+          <w:noProof/>
+        </w:rPr>
         <w:drawing>
           <wp:inline distT="0" distB="0" distL="0" distR="0" wp14:anchorId="2531C3B2" wp14:editId="17AEB42F">
             <wp:extent cx="6284289" cy="2465742"/>
@@ -928,6 +940,7 @@
       </w:pPr>
       <w:r>
         <w:rPr>
+          <w:noProof/>
           <w:lang w:val="es-MX"/>
         </w:rPr>
         <w:drawing>
@@ -969,10 +982,605 @@
     </w:p>
     <w:p>
       <w:pPr>
-        <w:rPr>
-          <w:lang w:val="es-MX"/>
-        </w:rPr>
-      </w:pPr>
+        <w:pStyle w:val="Prrafodelista"/>
+        <w:numPr>
+          <w:ilvl w:val="0"/>
+          <w:numId w:val="1"/>
+        </w:numPr>
+        <w:rPr>
+          <w:lang w:val="es-MX"/>
+        </w:rPr>
+      </w:pPr>
+      <w:r>
+        <w:rPr>
+          <w:lang w:val="es-MX"/>
+        </w:rPr>
+        <w:t>Características Spring 4</w:t>
+      </w:r>
+    </w:p>
+    <w:p>
+      <w:pPr>
+        <w:rPr>
+          <w:lang w:val="es-MX"/>
+        </w:rPr>
+      </w:pPr>
+      <w:r>
+        <w:rPr>
+          <w:lang w:val="es-MX"/>
+        </w:rPr>
+        <w:t>Es más ligero, rápido en ejecutar.</w:t>
+      </w:r>
+    </w:p>
+    <w:p>
+      <w:pPr>
+        <w:pStyle w:val="Prrafodelista"/>
+        <w:numPr>
+          <w:ilvl w:val="0"/>
+          <w:numId w:val="2"/>
+        </w:numPr>
+        <w:rPr>
+          <w:lang w:val="es-MX"/>
+        </w:rPr>
+      </w:pPr>
+      <w:r>
+        <w:rPr>
+          <w:lang w:val="es-MX"/>
+        </w:rPr>
+        <w:t xml:space="preserve">Agregando paquete de validaciones en </w:t>
+      </w:r>
+      <w:proofErr w:type="spellStart"/>
+      <w:r>
+        <w:rPr>
+          <w:lang w:val="es-MX"/>
+        </w:rPr>
+        <w:t>product-service</w:t>
+      </w:r>
+      <w:proofErr w:type="spellEnd"/>
+      <w:r>
+        <w:rPr>
+          <w:lang w:val="es-MX"/>
+        </w:rPr>
+        <w:t>:</w:t>
+      </w:r>
+    </w:p>
+    <w:p>
+      <w:pPr>
+        <w:pStyle w:val="Prrafodelista"/>
+        <w:rPr>
+          <w:lang w:val="es-MX"/>
+        </w:rPr>
+      </w:pPr>
+      <w:r>
+        <w:rPr>
+          <w:lang w:val="es-MX"/>
+        </w:rPr>
+        <w:drawing>
+          <wp:inline distT="0" distB="0" distL="0" distR="0" wp14:anchorId="68E1FB76" wp14:editId="59435CBE">
+            <wp:extent cx="6118035" cy="2455847"/>
+            <wp:effectExtent l="0" t="0" r="0" b="1905"/>
+            <wp:docPr id="1228285437" name="Imagen 1"/>
+            <wp:cNvGraphicFramePr>
+              <a:graphicFrameLocks xmlns:a="http://schemas.openxmlformats.org/drawingml/2006/main" noChangeAspect="1"/>
+            </wp:cNvGraphicFramePr>
+            <a:graphic xmlns:a="http://schemas.openxmlformats.org/drawingml/2006/main">
+              <a:graphicData uri="http://schemas.openxmlformats.org/drawingml/2006/picture">
+                <pic:pic xmlns:pic="http://schemas.openxmlformats.org/drawingml/2006/picture">
+                  <pic:nvPicPr>
+                    <pic:cNvPr id="1228285437" name=""/>
+                    <pic:cNvPicPr/>
+                  </pic:nvPicPr>
+                  <pic:blipFill>
+                    <a:blip r:embed="rId17"/>
+                    <a:stretch>
+                      <a:fillRect/>
+                    </a:stretch>
+                  </pic:blipFill>
+                  <pic:spPr>
+                    <a:xfrm>
+                      <a:off x="0" y="0"/>
+                      <a:ext cx="6129792" cy="2460567"/>
+                    </a:xfrm>
+                    <a:prstGeom prst="rect">
+                      <a:avLst/>
+                    </a:prstGeom>
+                  </pic:spPr>
+                </pic:pic>
+              </a:graphicData>
+            </a:graphic>
+          </wp:inline>
+        </w:drawing>
+      </w:r>
+    </w:p>
+    <w:p>
+      <w:pPr>
+        <w:rPr>
+          <w:lang w:val="es-MX"/>
+        </w:rPr>
+      </w:pPr>
+    </w:p>
+    <w:p>
+      <w:pPr>
+        <w:rPr>
+          <w:lang w:val="es-MX"/>
+        </w:rPr>
+      </w:pPr>
+    </w:p>
+    <w:p>
+      <w:pPr>
+        <w:rPr>
+          <w:lang w:val="es-MX"/>
+        </w:rPr>
+      </w:pPr>
+    </w:p>
+    <w:p>
+      <w:pPr>
+        <w:pStyle w:val="Prrafodelista"/>
+        <w:numPr>
+          <w:ilvl w:val="0"/>
+          <w:numId w:val="2"/>
+        </w:numPr>
+        <w:rPr>
+          <w:lang w:val="es-MX"/>
+        </w:rPr>
+      </w:pPr>
+      <w:r>
+        <w:rPr>
+          <w:lang w:val="es-MX"/>
+        </w:rPr>
+        <w:lastRenderedPageBreak/>
+        <w:t xml:space="preserve">Agregar hilos virtuales en </w:t>
+      </w:r>
+      <w:proofErr w:type="spellStart"/>
+      <w:proofErr w:type="gramStart"/>
+      <w:r>
+        <w:rPr>
+          <w:lang w:val="es-MX"/>
+        </w:rPr>
+        <w:t>aplication.yaml</w:t>
+      </w:r>
+      <w:proofErr w:type="spellEnd"/>
+      <w:proofErr w:type="gramEnd"/>
+    </w:p>
+    <w:p>
+      <w:pPr>
+        <w:pStyle w:val="Prrafodelista"/>
+        <w:pBdr>
+          <w:bottom w:val="double" w:sz="6" w:space="1" w:color="auto"/>
+        </w:pBdr>
+        <w:rPr>
+          <w:lang w:val="es-MX"/>
+        </w:rPr>
+      </w:pPr>
+      <w:r>
+        <w:rPr>
+          <w:lang w:val="es-MX"/>
+        </w:rPr>
+        <w:drawing>
+          <wp:inline distT="0" distB="0" distL="0" distR="0" wp14:anchorId="3E733BA7" wp14:editId="0FBD046C">
+            <wp:extent cx="3842286" cy="2480613"/>
+            <wp:effectExtent l="0" t="0" r="6350" b="0"/>
+            <wp:docPr id="120585728" name="Imagen 1"/>
+            <wp:cNvGraphicFramePr>
+              <a:graphicFrameLocks xmlns:a="http://schemas.openxmlformats.org/drawingml/2006/main" noChangeAspect="1"/>
+            </wp:cNvGraphicFramePr>
+            <a:graphic xmlns:a="http://schemas.openxmlformats.org/drawingml/2006/main">
+              <a:graphicData uri="http://schemas.openxmlformats.org/drawingml/2006/picture">
+                <pic:pic xmlns:pic="http://schemas.openxmlformats.org/drawingml/2006/picture">
+                  <pic:nvPicPr>
+                    <pic:cNvPr id="120585728" name=""/>
+                    <pic:cNvPicPr/>
+                  </pic:nvPicPr>
+                  <pic:blipFill>
+                    <a:blip r:embed="rId18"/>
+                    <a:stretch>
+                      <a:fillRect/>
+                    </a:stretch>
+                  </pic:blipFill>
+                  <pic:spPr>
+                    <a:xfrm>
+                      <a:off x="0" y="0"/>
+                      <a:ext cx="3851610" cy="2486633"/>
+                    </a:xfrm>
+                    <a:prstGeom prst="rect">
+                      <a:avLst/>
+                    </a:prstGeom>
+                  </pic:spPr>
+                </pic:pic>
+              </a:graphicData>
+            </a:graphic>
+          </wp:inline>
+        </w:drawing>
+      </w:r>
+    </w:p>
+    <w:p>
+      <w:pPr>
+        <w:pStyle w:val="Prrafodelista"/>
+        <w:rPr>
+          <w:lang w:val="es-MX"/>
+        </w:rPr>
+      </w:pPr>
+    </w:p>
+    <w:p>
+      <w:pPr>
+        <w:pBdr>
+          <w:top w:val="double" w:sz="6" w:space="1" w:color="auto"/>
+          <w:bottom w:val="double" w:sz="6" w:space="1" w:color="auto"/>
+        </w:pBdr>
+      </w:pPr>
+      <w:r>
+        <w:t xml:space="preserve">Los hilos virtuales (Virtual </w:t>
+      </w:r>
+      <w:proofErr w:type="spellStart"/>
+      <w:r>
+        <w:t>Threads</w:t>
+      </w:r>
+      <w:proofErr w:type="spellEnd"/>
+      <w:r>
+        <w:t>) en Spring Boot son hilos ligeros introducidos en Java 21 (JEP 444) que permiten manejar una concurrencia masiva (millones) con bajo consumo de memoria. A diferencia de los hilos de plataforma tradicionales (mapeo 1:1 con el sistema operativo), los hilos virtuales se ejecutan sobre un pool pequeño de hilos nativos y se "desmontan" durante operaciones bloqueantes (E/S, BD), optimizando la escalabilidad en Spring Boot 3.2+ sin necesidad de cambiar el modelo de programación síncrono.</w:t>
+      </w:r>
+    </w:p>
+    <w:p/>
+    <w:p>
+      <w:pPr>
+        <w:pStyle w:val="Prrafodelista"/>
+        <w:numPr>
+          <w:ilvl w:val="0"/>
+          <w:numId w:val="1"/>
+        </w:numPr>
+        <w:rPr>
+          <w:lang w:val="es-MX"/>
+        </w:rPr>
+      </w:pPr>
+      <w:r>
+        <w:rPr>
+          <w:lang w:val="es-MX"/>
+        </w:rPr>
+        <w:t>Service Discovery (Eureka Server)</w:t>
+      </w:r>
+    </w:p>
+    <w:p>
+      <w:pPr>
+        <w:rPr>
+          <w:lang w:val="es-MX"/>
+        </w:rPr>
+      </w:pPr>
+      <w:r>
+        <w:rPr>
+          <w:lang w:val="es-MX"/>
+        </w:rPr>
+        <w:drawing>
+          <wp:inline distT="0" distB="0" distL="0" distR="0" wp14:anchorId="1A29013F" wp14:editId="18E7FED8">
+            <wp:extent cx="6753365" cy="2548394"/>
+            <wp:effectExtent l="0" t="0" r="0" b="4445"/>
+            <wp:docPr id="496002190" name="Imagen 1"/>
+            <wp:cNvGraphicFramePr>
+              <a:graphicFrameLocks xmlns:a="http://schemas.openxmlformats.org/drawingml/2006/main" noChangeAspect="1"/>
+            </wp:cNvGraphicFramePr>
+            <a:graphic xmlns:a="http://schemas.openxmlformats.org/drawingml/2006/main">
+              <a:graphicData uri="http://schemas.openxmlformats.org/drawingml/2006/picture">
+                <pic:pic xmlns:pic="http://schemas.openxmlformats.org/drawingml/2006/picture">
+                  <pic:nvPicPr>
+                    <pic:cNvPr id="496002190" name=""/>
+                    <pic:cNvPicPr/>
+                  </pic:nvPicPr>
+                  <pic:blipFill>
+                    <a:blip r:embed="rId19"/>
+                    <a:stretch>
+                      <a:fillRect/>
+                    </a:stretch>
+                  </pic:blipFill>
+                  <pic:spPr>
+                    <a:xfrm>
+                      <a:off x="0" y="0"/>
+                      <a:ext cx="6759005" cy="2550522"/>
+                    </a:xfrm>
+                    <a:prstGeom prst="rect">
+                      <a:avLst/>
+                    </a:prstGeom>
+                  </pic:spPr>
+                </pic:pic>
+              </a:graphicData>
+            </a:graphic>
+          </wp:inline>
+        </w:drawing>
+      </w:r>
+    </w:p>
+    <w:p>
+      <w:pPr>
+        <w:rPr>
+          <w:lang w:val="es-MX"/>
+        </w:rPr>
+      </w:pPr>
+      <w:r>
+        <w:rPr>
+          <w:lang w:val="es-MX"/>
+        </w:rPr>
+        <w:lastRenderedPageBreak/>
+        <w:drawing>
+          <wp:inline distT="0" distB="0" distL="0" distR="0" wp14:anchorId="758F9887" wp14:editId="7BB0231D">
+            <wp:extent cx="3816528" cy="6608618"/>
+            <wp:effectExtent l="0" t="0" r="0" b="1905"/>
+            <wp:docPr id="542933900" name="Imagen 1"/>
+            <wp:cNvGraphicFramePr>
+              <a:graphicFrameLocks xmlns:a="http://schemas.openxmlformats.org/drawingml/2006/main" noChangeAspect="1"/>
+            </wp:cNvGraphicFramePr>
+            <a:graphic xmlns:a="http://schemas.openxmlformats.org/drawingml/2006/main">
+              <a:graphicData uri="http://schemas.openxmlformats.org/drawingml/2006/picture">
+                <pic:pic xmlns:pic="http://schemas.openxmlformats.org/drawingml/2006/picture">
+                  <pic:nvPicPr>
+                    <pic:cNvPr id="542933900" name=""/>
+                    <pic:cNvPicPr/>
+                  </pic:nvPicPr>
+                  <pic:blipFill>
+                    <a:blip r:embed="rId20"/>
+                    <a:stretch>
+                      <a:fillRect/>
+                    </a:stretch>
+                  </pic:blipFill>
+                  <pic:spPr>
+                    <a:xfrm>
+                      <a:off x="0" y="0"/>
+                      <a:ext cx="3822212" cy="6618461"/>
+                    </a:xfrm>
+                    <a:prstGeom prst="rect">
+                      <a:avLst/>
+                    </a:prstGeom>
+                  </pic:spPr>
+                </pic:pic>
+              </a:graphicData>
+            </a:graphic>
+          </wp:inline>
+        </w:drawing>
+      </w:r>
+    </w:p>
+    <w:p>
+      <w:pPr>
+        <w:rPr>
+          <w:lang w:val="es-MX"/>
+        </w:rPr>
+      </w:pPr>
+      <w:r>
+        <w:rPr>
+          <w:lang w:val="es-MX"/>
+        </w:rPr>
+        <w:t xml:space="preserve">Apagar las funciones de replicación y de sincronización. Eureka también trabaja como cliente, esto porque en sistemas reales existen varios servidores de Eureka, y estos se tienen que comunicar cuando el “servidor A” tiene un nuevo </w:t>
+      </w:r>
+      <w:proofErr w:type="spellStart"/>
+      <w:r>
+        <w:rPr>
+          <w:lang w:val="es-MX"/>
+        </w:rPr>
+        <w:t>micro-</w:t>
+      </w:r>
+      <w:r>
+        <w:rPr>
+          <w:lang w:val="es-MX"/>
+        </w:rPr>
+        <w:t>servicio</w:t>
+      </w:r>
+      <w:proofErr w:type="spellEnd"/>
+      <w:r>
+        <w:rPr>
+          <w:lang w:val="es-MX"/>
+        </w:rPr>
+        <w:t xml:space="preserve"> a los demás servidores Eureka. Para este proyecto, solo se tendrá un servidor Eureka, por esta razón, se deshabilita la opción que Eureka sea otro cliente.</w:t>
+      </w:r>
+    </w:p>
+    <w:p>
+      <w:pPr>
+        <w:rPr>
+          <w:lang w:val="es-MX"/>
+        </w:rPr>
+      </w:pPr>
+      <w:r>
+        <w:rPr>
+          <w:lang w:val="es-MX"/>
+        </w:rPr>
+        <w:drawing>
+          <wp:inline distT="0" distB="0" distL="0" distR="0" wp14:anchorId="3814DC2D" wp14:editId="02B7ED1B">
+            <wp:extent cx="4735139" cy="2388216"/>
+            <wp:effectExtent l="0" t="0" r="0" b="0"/>
+            <wp:docPr id="1335801794" name="Imagen 1"/>
+            <wp:cNvGraphicFramePr>
+              <a:graphicFrameLocks xmlns:a="http://schemas.openxmlformats.org/drawingml/2006/main" noChangeAspect="1"/>
+            </wp:cNvGraphicFramePr>
+            <a:graphic xmlns:a="http://schemas.openxmlformats.org/drawingml/2006/main">
+              <a:graphicData uri="http://schemas.openxmlformats.org/drawingml/2006/picture">
+                <pic:pic xmlns:pic="http://schemas.openxmlformats.org/drawingml/2006/picture">
+                  <pic:nvPicPr>
+                    <pic:cNvPr id="1335801794" name=""/>
+                    <pic:cNvPicPr/>
+                  </pic:nvPicPr>
+                  <pic:blipFill>
+                    <a:blip r:embed="rId21"/>
+                    <a:stretch>
+                      <a:fillRect/>
+                    </a:stretch>
+                  </pic:blipFill>
+                  <pic:spPr>
+                    <a:xfrm>
+                      <a:off x="0" y="0"/>
+                      <a:ext cx="4743102" cy="2392232"/>
+                    </a:xfrm>
+                    <a:prstGeom prst="rect">
+                      <a:avLst/>
+                    </a:prstGeom>
+                  </pic:spPr>
+                </pic:pic>
+              </a:graphicData>
+            </a:graphic>
+          </wp:inline>
+        </w:drawing>
+      </w:r>
+    </w:p>
+    <w:p>
+      <w:pPr>
+        <w:rPr>
+          <w:lang w:val="es-MX"/>
+        </w:rPr>
+      </w:pPr>
+      <w:r>
+        <w:rPr>
+          <w:lang w:val="es-MX"/>
+        </w:rPr>
+        <w:lastRenderedPageBreak/>
+        <w:t xml:space="preserve">Luego, convertir un proyecto </w:t>
+      </w:r>
+      <w:proofErr w:type="spellStart"/>
+      <w:r>
+        <w:rPr>
+          <w:lang w:val="es-MX"/>
+        </w:rPr>
+        <w:t>spring-boot</w:t>
+      </w:r>
+      <w:proofErr w:type="spellEnd"/>
+      <w:r>
+        <w:rPr>
+          <w:lang w:val="es-MX"/>
+        </w:rPr>
+        <w:t xml:space="preserve"> común en un servidor de registro</w:t>
+      </w:r>
+    </w:p>
+    <w:p>
+      <w:pPr>
+        <w:rPr>
+          <w:lang w:val="es-MX"/>
+        </w:rPr>
+      </w:pPr>
+      <w:r>
+        <w:rPr>
+          <w:lang w:val="es-MX"/>
+        </w:rPr>
+        <w:drawing>
+          <wp:inline distT="0" distB="0" distL="0" distR="0" wp14:anchorId="3105C037" wp14:editId="71687319">
+            <wp:extent cx="6444606" cy="1448521"/>
+            <wp:effectExtent l="0" t="0" r="0" b="0"/>
+            <wp:docPr id="1210217295" name="Imagen 1"/>
+            <wp:cNvGraphicFramePr>
+              <a:graphicFrameLocks xmlns:a="http://schemas.openxmlformats.org/drawingml/2006/main" noChangeAspect="1"/>
+            </wp:cNvGraphicFramePr>
+            <a:graphic xmlns:a="http://schemas.openxmlformats.org/drawingml/2006/main">
+              <a:graphicData uri="http://schemas.openxmlformats.org/drawingml/2006/picture">
+                <pic:pic xmlns:pic="http://schemas.openxmlformats.org/drawingml/2006/picture">
+                  <pic:nvPicPr>
+                    <pic:cNvPr id="1210217295" name=""/>
+                    <pic:cNvPicPr/>
+                  </pic:nvPicPr>
+                  <pic:blipFill>
+                    <a:blip r:embed="rId22"/>
+                    <a:stretch>
+                      <a:fillRect/>
+                    </a:stretch>
+                  </pic:blipFill>
+                  <pic:spPr>
+                    <a:xfrm>
+                      <a:off x="0" y="0"/>
+                      <a:ext cx="6449062" cy="1449523"/>
+                    </a:xfrm>
+                    <a:prstGeom prst="rect">
+                      <a:avLst/>
+                    </a:prstGeom>
+                  </pic:spPr>
+                </pic:pic>
+              </a:graphicData>
+            </a:graphic>
+          </wp:inline>
+        </w:drawing>
+      </w:r>
+    </w:p>
+    <w:p>
+      <w:pPr>
+        <w:rPr>
+          <w:lang w:val="es-MX"/>
+        </w:rPr>
+      </w:pPr>
+      <w:r>
+        <w:rPr>
+          <w:lang w:val="es-MX"/>
+        </w:rPr>
+        <w:drawing>
+          <wp:inline distT="0" distB="0" distL="0" distR="0" wp14:anchorId="39F54CB1" wp14:editId="4EC3B3E4">
+            <wp:extent cx="5114570" cy="4172242"/>
+            <wp:effectExtent l="0" t="0" r="0" b="0"/>
+            <wp:docPr id="1102529154" name="Imagen 1"/>
+            <wp:cNvGraphicFramePr>
+              <a:graphicFrameLocks xmlns:a="http://schemas.openxmlformats.org/drawingml/2006/main" noChangeAspect="1"/>
+            </wp:cNvGraphicFramePr>
+            <a:graphic xmlns:a="http://schemas.openxmlformats.org/drawingml/2006/main">
+              <a:graphicData uri="http://schemas.openxmlformats.org/drawingml/2006/picture">
+                <pic:pic xmlns:pic="http://schemas.openxmlformats.org/drawingml/2006/picture">
+                  <pic:nvPicPr>
+                    <pic:cNvPr id="1102529154" name=""/>
+                    <pic:cNvPicPr/>
+                  </pic:nvPicPr>
+                  <pic:blipFill>
+                    <a:blip r:embed="rId23"/>
+                    <a:stretch>
+                      <a:fillRect/>
+                    </a:stretch>
+                  </pic:blipFill>
+                  <pic:spPr>
+                    <a:xfrm>
+                      <a:off x="0" y="0"/>
+                      <a:ext cx="5122106" cy="4178389"/>
+                    </a:xfrm>
+                    <a:prstGeom prst="rect">
+                      <a:avLst/>
+                    </a:prstGeom>
+                  </pic:spPr>
+                </pic:pic>
+              </a:graphicData>
+            </a:graphic>
+          </wp:inline>
+        </w:drawing>
+      </w:r>
+    </w:p>
+    <w:p>
+      <w:pPr>
+        <w:rPr>
+          <w:lang w:val="es-MX"/>
+        </w:rPr>
+      </w:pPr>
+      <w:r>
+        <w:rPr>
+          <w:lang w:val="es-MX"/>
+        </w:rPr>
+        <w:drawing>
+          <wp:inline distT="0" distB="0" distL="0" distR="0" wp14:anchorId="10148D12" wp14:editId="01A7AB2E">
+            <wp:extent cx="5114290" cy="3815364"/>
+            <wp:effectExtent l="0" t="0" r="0" b="0"/>
+            <wp:docPr id="1609974930" name="Imagen 1"/>
+            <wp:cNvGraphicFramePr>
+              <a:graphicFrameLocks xmlns:a="http://schemas.openxmlformats.org/drawingml/2006/main" noChangeAspect="1"/>
+            </wp:cNvGraphicFramePr>
+            <a:graphic xmlns:a="http://schemas.openxmlformats.org/drawingml/2006/main">
+              <a:graphicData uri="http://schemas.openxmlformats.org/drawingml/2006/picture">
+                <pic:pic xmlns:pic="http://schemas.openxmlformats.org/drawingml/2006/picture">
+                  <pic:nvPicPr>
+                    <pic:cNvPr id="1609974930" name=""/>
+                    <pic:cNvPicPr/>
+                  </pic:nvPicPr>
+                  <pic:blipFill>
+                    <a:blip r:embed="rId24"/>
+                    <a:stretch>
+                      <a:fillRect/>
+                    </a:stretch>
+                  </pic:blipFill>
+                  <pic:spPr>
+                    <a:xfrm>
+                      <a:off x="0" y="0"/>
+                      <a:ext cx="5122702" cy="3821639"/>
+                    </a:xfrm>
+                    <a:prstGeom prst="rect">
+                      <a:avLst/>
+                    </a:prstGeom>
+                  </pic:spPr>
+                </pic:pic>
+              </a:graphicData>
+            </a:graphic>
+          </wp:inline>
+        </w:drawing>
+      </w:r>
     </w:p>
     <w:p>
       <w:pPr>
@@ -1920,7 +2528,6 @@
   <w:style w:type="character" w:default="1" w:styleId="Fuentedeprrafopredeter">
     <w:name w:val="Default Paragraph Font"/>
     <w:uiPriority w:val="1"/>
-    <w:semiHidden/>
     <w:unhideWhenUsed/>
   </w:style>
   <w:style w:type="table" w:default="1" w:styleId="Tablanormal">

</xml_diff>